<commit_message>
Made changes to the finger and notes mapping
</commit_message>
<xml_diff>
--- a/Idea Doc.docx
+++ b/Idea Doc.docx
@@ -2,2189 +2,6 @@
 <file path=word/document.xml><?xml version="1.0" encoding="utf-8"?>
 <w:document xmlns:wpc="http://schemas.microsoft.com/office/word/2010/wordprocessingCanvas" xmlns:cx="http://schemas.microsoft.com/office/drawing/2014/chartex" xmlns:cx1="http://schemas.microsoft.com/office/drawing/2015/9/8/chartex" xmlns:cx2="http://schemas.microsoft.com/office/drawing/2015/10/21/chartex" xmlns:cx3="http://schemas.microsoft.com/office/drawing/2016/5/9/chartex" xmlns:cx4="http://schemas.microsoft.com/office/drawing/2016/5/10/chartex" xmlns:cx5="http://schemas.microsoft.com/office/drawing/2016/5/11/chartex" xmlns:cx6="http://schemas.microsoft.com/office/drawing/2016/5/12/chartex" xmlns:cx7="http://schemas.microsoft.com/office/drawing/2016/5/13/chartex" xmlns:cx8="http://schemas.microsoft.com/office/drawing/2016/5/14/chartex" xmlns:mc="http://schemas.openxmlformats.org/markup-compatibility/2006" xmlns:aink="http://schemas.microsoft.com/office/drawing/2016/ink" xmlns:am3d="http://schemas.microsoft.com/office/drawing/2017/model3d" xmlns:o="urn:schemas-microsoft-com:office:office" xmlns:oel="http://schemas.microsoft.com/office/2019/extlst" xmlns:r="http://schemas.openxmlformats.org/officeDocument/2006/relationships" xmlns:m="http://schemas.openxmlformats.org/officeDocument/2006/math" xmlns:v="urn:schemas-microsoft-com:vml" xmlns:wp14="http://schemas.microsoft.com/office/word/2010/wordprocessingDrawing" xmlns:wp="http://schemas.openxmlformats.org/drawingml/2006/wordprocessingDrawing" xmlns:w10="urn:schemas-microsoft-com:office:word" xmlns:w="http://schemas.openxmlformats.org/wordprocessingml/2006/main" xmlns:w14="http://schemas.microsoft.com/office/word/2010/wordml" xmlns:w15="http://schemas.microsoft.com/office/word/2012/wordml" xmlns:w16cex="http://schemas.microsoft.com/office/word/2018/wordml/cex" xmlns:w16cid="http://schemas.microsoft.com/office/word/2016/wordml/cid" xmlns:w16="http://schemas.microsoft.com/office/word/2018/wordml" xmlns:w16du="http://schemas.microsoft.com/office/word/2023/wordml/word16du" xmlns:w16sdtdh="http://schemas.microsoft.com/office/word/2020/wordml/sdtdatahash" xmlns:w16sdtfl="http://schemas.microsoft.com/office/word/2024/wordml/sdtformatlock" xmlns:w16se="http://schemas.microsoft.com/office/word/2015/wordml/symex" xmlns:wpg="http://schemas.microsoft.com/office/word/2010/wordprocessingGroup" xmlns:wpi="http://schemas.microsoft.com/office/word/2010/wordprocessingInk" xmlns:wne="http://schemas.microsoft.com/office/word/2006/wordml" xmlns:wps="http://schemas.microsoft.com/office/word/2010/wordprocessingShape" mc:Ignorable="w14 w15 w16se w16cid w16 w16cex w16sdtdh w16sdtfl w16du wp14">
   <w:body>
-    <w:p>
-      <w:pPr>
-        <w:rPr>
-          <w:b/>
-          <w:bCs/>
-        </w:rPr>
-      </w:pPr>
-      <w:r>
-        <w:rPr>
-          <w:b/>
-          <w:bCs/>
-        </w:rPr>
-        <w:t>Hand-Controlled Musical Instrument</w:t>
-      </w:r>
-    </w:p>
-    <w:p>
-      <w:pPr>
-        <w:rPr>
-          <w:b/>
-          <w:bCs/>
-        </w:rPr>
-      </w:pPr>
-      <w:r>
-        <w:rPr>
-          <w:rFonts w:ascii="Segoe UI Emoji" w:hAnsi="Segoe UI Emoji" w:cs="Segoe UI Emoji"/>
-          <w:b/>
-          <w:bCs/>
-        </w:rPr>
-        <w:t>🏗️</w:t>
-      </w:r>
-      <w:r>
-        <w:rPr>
-          <w:b/>
-          <w:bCs/>
-        </w:rPr>
-        <w:t xml:space="preserve"> System Architecture &amp; Design Document</w:t>
-      </w:r>
-    </w:p>
-    <w:p>
-      <w:r>
-        <w:pict w14:anchorId="70D5C848">
-          <v:rect id="_x0000_i1097" style="width:0;height:1.5pt" o:hralign="center" o:hrstd="t" o:hr="t" fillcolor="#a0a0a0" stroked="f"/>
-        </w:pict>
-      </w:r>
-    </w:p>
-    <w:p>
-      <w:pPr>
-        <w:rPr>
-          <w:b/>
-          <w:bCs/>
-        </w:rPr>
-      </w:pPr>
-      <w:r>
-        <w:rPr>
-          <w:b/>
-          <w:bCs/>
-        </w:rPr>
-        <w:t xml:space="preserve">1. </w:t>
-      </w:r>
-      <w:r>
-        <w:rPr>
-          <w:rFonts w:ascii="Segoe UI Emoji" w:hAnsi="Segoe UI Emoji" w:cs="Segoe UI Emoji"/>
-          <w:b/>
-          <w:bCs/>
-        </w:rPr>
-        <w:t>📌</w:t>
-      </w:r>
-      <w:r>
-        <w:rPr>
-          <w:b/>
-          <w:bCs/>
-        </w:rPr>
-        <w:t xml:space="preserve"> Project Overview</w:t>
-      </w:r>
-    </w:p>
-    <w:p>
-      <w:r>
-        <w:t>A real-time gesture-based musical instrument that uses</w:t>
-      </w:r>
-      <w:r>
-        <w:br/>
-        <w:t>MediaPipe Hands for hand tracking and converts finger gestures into musical notes.</w:t>
-      </w:r>
-    </w:p>
-    <w:p>
-      <w:pPr>
-        <w:rPr>
-          <w:b/>
-          <w:bCs/>
-        </w:rPr>
-      </w:pPr>
-      <w:r>
-        <w:rPr>
-          <w:b/>
-          <w:bCs/>
-        </w:rPr>
-        <w:t>Core Goals</w:t>
-      </w:r>
-    </w:p>
-    <w:p>
-      <w:pPr>
-        <w:numPr>
-          <w:ilvl w:val="0"/>
-          <w:numId w:val="1"/>
-        </w:numPr>
-      </w:pPr>
-      <w:r>
-        <w:t xml:space="preserve">Real-time performance (&lt;50ms latency target) </w:t>
-      </w:r>
-    </w:p>
-    <w:p>
-      <w:pPr>
-        <w:numPr>
-          <w:ilvl w:val="0"/>
-          <w:numId w:val="1"/>
-        </w:numPr>
-      </w:pPr>
-      <w:r>
-        <w:t xml:space="preserve">Modular and extensible architecture </w:t>
-      </w:r>
-    </w:p>
-    <w:p>
-      <w:pPr>
-        <w:numPr>
-          <w:ilvl w:val="0"/>
-          <w:numId w:val="1"/>
-        </w:numPr>
-      </w:pPr>
-      <w:r>
-        <w:t xml:space="preserve">Clean separation between </w:t>
-      </w:r>
-      <w:r>
-        <w:rPr>
-          <w:b/>
-          <w:bCs/>
-        </w:rPr>
-        <w:t>vision</w:t>
-      </w:r>
-      <w:r>
-        <w:t xml:space="preserve">, </w:t>
-      </w:r>
-      <w:r>
-        <w:rPr>
-          <w:b/>
-          <w:bCs/>
-        </w:rPr>
-        <w:t>logic</w:t>
-      </w:r>
-      <w:r>
-        <w:t xml:space="preserve">, and </w:t>
-      </w:r>
-      <w:r>
-        <w:rPr>
-          <w:b/>
-          <w:bCs/>
-        </w:rPr>
-        <w:t>audio</w:t>
-      </w:r>
-      <w:r>
-        <w:t xml:space="preserve"> </w:t>
-      </w:r>
-    </w:p>
-    <w:p>
-      <w:r>
-        <w:pict w14:anchorId="54715942">
-          <v:rect id="_x0000_i1098" style="width:0;height:1.5pt" o:hralign="center" o:hrstd="t" o:hr="t" fillcolor="#a0a0a0" stroked="f"/>
-        </w:pict>
-      </w:r>
-    </w:p>
-    <w:p>
-      <w:pPr>
-        <w:rPr>
-          <w:b/>
-          <w:bCs/>
-        </w:rPr>
-      </w:pPr>
-      <w:r>
-        <w:rPr>
-          <w:b/>
-          <w:bCs/>
-        </w:rPr>
-        <w:t xml:space="preserve">2. </w:t>
-      </w:r>
-      <w:r>
-        <w:rPr>
-          <w:rFonts w:ascii="Segoe UI Emoji" w:hAnsi="Segoe UI Emoji" w:cs="Segoe UI Emoji"/>
-          <w:b/>
-          <w:bCs/>
-        </w:rPr>
-        <w:t>🧠</w:t>
-      </w:r>
-      <w:r>
-        <w:rPr>
-          <w:b/>
-          <w:bCs/>
-        </w:rPr>
-        <w:t xml:space="preserve"> High-Level Architecture</w:t>
-      </w:r>
-    </w:p>
-    <w:p>
-      <w:r>
-        <w:t>[ Webcam Input ]</w:t>
-      </w:r>
-      <w:r>
-        <w:br/>
-        <w:t xml:space="preserve">        ↓</w:t>
-      </w:r>
-      <w:r>
-        <w:br/>
-        <w:t>[ Vision Module ]</w:t>
-      </w:r>
-      <w:r>
-        <w:br/>
-        <w:t>(MediaPipe Hands + OpenCV)</w:t>
-      </w:r>
-      <w:r>
-        <w:br/>
-        <w:t xml:space="preserve">        ↓</w:t>
-      </w:r>
-      <w:r>
-        <w:br/>
-        <w:t>[ Gesture Processing Engine ]</w:t>
-      </w:r>
-      <w:r>
-        <w:br/>
-        <w:t>(Finger detection + gesture logic)</w:t>
-      </w:r>
-      <w:r>
-        <w:br/>
-        <w:t xml:space="preserve">        ↓</w:t>
-      </w:r>
-      <w:r>
-        <w:br/>
-        <w:t>[ Music Mapping Engine ]</w:t>
-      </w:r>
-      <w:r>
-        <w:br/>
-        <w:t>(Notes, octaves, instruments)</w:t>
-      </w:r>
-      <w:r>
-        <w:br/>
-        <w:t xml:space="preserve">        ↓</w:t>
-      </w:r>
-      <w:r>
-        <w:br/>
-        <w:t>[ Audio Engine ]</w:t>
-      </w:r>
-      <w:r>
-        <w:br/>
-        <w:t>(Pygame / Synth)</w:t>
-      </w:r>
-      <w:r>
-        <w:br/>
-        <w:t xml:space="preserve">        ↓</w:t>
-      </w:r>
-      <w:r>
-        <w:br/>
-        <w:t>[ Output Sound + UI Overlay ]</w:t>
-      </w:r>
-    </w:p>
-    <w:p>
-      <w:r>
-        <w:pict w14:anchorId="1B7A106C">
-          <v:rect id="_x0000_i1099" style="width:0;height:1.5pt" o:hralign="center" o:hrstd="t" o:hr="t" fillcolor="#a0a0a0" stroked="f"/>
-        </w:pict>
-      </w:r>
-    </w:p>
-    <w:p>
-      <w:pPr>
-        <w:rPr>
-          <w:b/>
-          <w:bCs/>
-        </w:rPr>
-      </w:pPr>
-      <w:r>
-        <w:rPr>
-          <w:b/>
-          <w:bCs/>
-        </w:rPr>
-        <w:t xml:space="preserve">3. </w:t>
-      </w:r>
-      <w:r>
-        <w:rPr>
-          <w:rFonts w:ascii="Segoe UI Emoji" w:hAnsi="Segoe UI Emoji" w:cs="Segoe UI Emoji"/>
-          <w:b/>
-          <w:bCs/>
-        </w:rPr>
-        <w:t>🧩</w:t>
-      </w:r>
-      <w:r>
-        <w:rPr>
-          <w:b/>
-          <w:bCs/>
-        </w:rPr>
-        <w:t xml:space="preserve"> Core Modules (Clean Separation)</w:t>
-      </w:r>
-    </w:p>
-    <w:p>
-      <w:pPr>
-        <w:rPr>
-          <w:b/>
-          <w:bCs/>
-        </w:rPr>
-      </w:pPr>
-      <w:r>
-        <w:rPr>
-          <w:b/>
-          <w:bCs/>
-        </w:rPr>
-        <w:t xml:space="preserve">3.1 </w:t>
-      </w:r>
-      <w:r>
-        <w:rPr>
-          <w:rFonts w:ascii="Segoe UI Emoji" w:hAnsi="Segoe UI Emoji" w:cs="Segoe UI Emoji"/>
-          <w:b/>
-          <w:bCs/>
-        </w:rPr>
-        <w:t>🎥</w:t>
-      </w:r>
-      <w:r>
-        <w:rPr>
-          <w:b/>
-          <w:bCs/>
-        </w:rPr>
-        <w:t xml:space="preserve"> Vision Module</w:t>
-      </w:r>
-    </w:p>
-    <w:p>
-      <w:r>
-        <w:rPr>
-          <w:b/>
-          <w:bCs/>
-        </w:rPr>
-        <w:t>Responsibility:</w:t>
-      </w:r>
-      <w:r>
-        <w:t xml:space="preserve"> Capture and process frames</w:t>
-      </w:r>
-    </w:p>
-    <w:p>
-      <w:r>
-        <w:rPr>
-          <w:b/>
-          <w:bCs/>
-        </w:rPr>
-        <w:t>Tech:</w:t>
-      </w:r>
-    </w:p>
-    <w:p>
-      <w:pPr>
-        <w:numPr>
-          <w:ilvl w:val="0"/>
-          <w:numId w:val="2"/>
-        </w:numPr>
-      </w:pPr>
-      <w:r>
-        <w:lastRenderedPageBreak/>
-        <w:t xml:space="preserve">OpenCV </w:t>
-      </w:r>
-    </w:p>
-    <w:p>
-      <w:pPr>
-        <w:numPr>
-          <w:ilvl w:val="0"/>
-          <w:numId w:val="2"/>
-        </w:numPr>
-      </w:pPr>
-      <w:r>
-        <w:t xml:space="preserve">MediaPipe Hands </w:t>
-      </w:r>
-    </w:p>
-    <w:p>
-      <w:r>
-        <w:rPr>
-          <w:b/>
-          <w:bCs/>
-        </w:rPr>
-        <w:t>Functions:</w:t>
-      </w:r>
-    </w:p>
-    <w:p>
-      <w:pPr>
-        <w:numPr>
-          <w:ilvl w:val="0"/>
-          <w:numId w:val="3"/>
-        </w:numPr>
-      </w:pPr>
-      <w:r>
-        <w:t xml:space="preserve">Frame capture </w:t>
-      </w:r>
-    </w:p>
-    <w:p>
-      <w:pPr>
-        <w:numPr>
-          <w:ilvl w:val="0"/>
-          <w:numId w:val="3"/>
-        </w:numPr>
-      </w:pPr>
-      <w:r>
-        <w:t xml:space="preserve">Hand landmark extraction (21 points) </w:t>
-      </w:r>
-    </w:p>
-    <w:p>
-      <w:pPr>
-        <w:numPr>
-          <w:ilvl w:val="0"/>
-          <w:numId w:val="3"/>
-        </w:numPr>
-      </w:pPr>
-      <w:r>
-        <w:t xml:space="preserve">Hand classification (left/right) </w:t>
-      </w:r>
-    </w:p>
-    <w:p>
-      <w:r>
-        <w:rPr>
-          <w:b/>
-          <w:bCs/>
-        </w:rPr>
-        <w:t>Output:</w:t>
-      </w:r>
-    </w:p>
-    <w:p>
-      <w:r>
-        <w:t>HandData = {</w:t>
-      </w:r>
-      <w:r>
-        <w:br/>
-        <w:t xml:space="preserve">    "handedness": "Left" | "Right",</w:t>
-      </w:r>
-      <w:r>
-        <w:br/>
-        <w:t xml:space="preserve">    "landmarks": [(x, y, z)...],</w:t>
-      </w:r>
-      <w:r>
-        <w:br/>
-        <w:t>}</w:t>
-      </w:r>
-    </w:p>
-    <w:p>
-      <w:r>
-        <w:pict w14:anchorId="34D4B1BD">
-          <v:rect id="_x0000_i1100" style="width:0;height:1.5pt" o:hralign="center" o:hrstd="t" o:hr="t" fillcolor="#a0a0a0" stroked="f"/>
-        </w:pict>
-      </w:r>
-    </w:p>
-    <w:p>
-      <w:pPr>
-        <w:rPr>
-          <w:b/>
-          <w:bCs/>
-        </w:rPr>
-      </w:pPr>
-      <w:r>
-        <w:rPr>
-          <w:b/>
-          <w:bCs/>
-        </w:rPr>
-        <w:t xml:space="preserve">3.2 </w:t>
-      </w:r>
-      <w:r>
-        <w:rPr>
-          <w:rFonts w:ascii="Segoe UI Emoji" w:hAnsi="Segoe UI Emoji" w:cs="Segoe UI Emoji"/>
-          <w:b/>
-          <w:bCs/>
-        </w:rPr>
-        <w:t>✋</w:t>
-      </w:r>
-      <w:r>
-        <w:rPr>
-          <w:b/>
-          <w:bCs/>
-        </w:rPr>
-        <w:t xml:space="preserve"> Gesture Processing Engine</w:t>
-      </w:r>
-    </w:p>
-    <w:p>
-      <w:r>
-        <w:rPr>
-          <w:b/>
-          <w:bCs/>
-        </w:rPr>
-        <w:t>Responsibility:</w:t>
-      </w:r>
-      <w:r>
-        <w:t xml:space="preserve"> Convert raw landmarks → meaningful gestures</w:t>
-      </w:r>
-    </w:p>
-    <w:p>
-      <w:r>
-        <w:rPr>
-          <w:b/>
-          <w:bCs/>
-        </w:rPr>
-        <w:t>Key Logic:</w:t>
-      </w:r>
-    </w:p>
-    <w:p>
-      <w:pPr>
-        <w:numPr>
-          <w:ilvl w:val="0"/>
-          <w:numId w:val="4"/>
-        </w:numPr>
-      </w:pPr>
-      <w:r>
-        <w:t xml:space="preserve">Finger state detection: </w:t>
-      </w:r>
-    </w:p>
-    <w:p>
-      <w:pPr>
-        <w:numPr>
-          <w:ilvl w:val="1"/>
-          <w:numId w:val="4"/>
-        </w:numPr>
-      </w:pPr>
-      <w:r>
-        <w:t xml:space="preserve">Compare fingertip vs PIP joint distance </w:t>
-      </w:r>
-    </w:p>
-    <w:p>
-      <w:pPr>
-        <w:numPr>
-          <w:ilvl w:val="0"/>
-          <w:numId w:val="4"/>
-        </w:numPr>
-      </w:pPr>
-      <w:r>
-        <w:t xml:space="preserve">Gesture recognition: </w:t>
-      </w:r>
-    </w:p>
-    <w:p>
-      <w:pPr>
-        <w:numPr>
-          <w:ilvl w:val="1"/>
-          <w:numId w:val="4"/>
-        </w:numPr>
-      </w:pPr>
-      <w:r>
-        <w:t xml:space="preserve">Finger bent/extended </w:t>
-      </w:r>
-    </w:p>
-    <w:p>
-      <w:pPr>
-        <w:numPr>
-          <w:ilvl w:val="1"/>
-          <w:numId w:val="4"/>
-        </w:numPr>
-      </w:pPr>
-      <w:r>
-        <w:t xml:space="preserve">Swipe detection (velocity-based) </w:t>
-      </w:r>
-    </w:p>
-    <w:p>
-      <w:pPr>
-        <w:numPr>
-          <w:ilvl w:val="1"/>
-          <w:numId w:val="4"/>
-        </w:numPr>
-      </w:pPr>
-      <w:r>
-        <w:t xml:space="preserve">Pinky-based octave shift </w:t>
-      </w:r>
-    </w:p>
-    <w:p>
-      <w:r>
-        <w:rPr>
-          <w:b/>
-          <w:bCs/>
-        </w:rPr>
-        <w:t>Output:</w:t>
-      </w:r>
-    </w:p>
-    <w:p>
-      <w:r>
-        <w:t>GestureState = {</w:t>
-      </w:r>
-      <w:r>
-        <w:br/>
-        <w:t xml:space="preserve">    "left_hand": {"index": True, "middle": False, ...},</w:t>
-      </w:r>
-      <w:r>
-        <w:br/>
-        <w:t xml:space="preserve">    "right_hand": {...},</w:t>
-      </w:r>
-      <w:r>
-        <w:br/>
-        <w:t xml:space="preserve">    "swipe": "left" | "right" | None,</w:t>
-      </w:r>
-      <w:r>
-        <w:br/>
-        <w:t xml:space="preserve">    "octave_shift": +1 | -1 | 0</w:t>
-      </w:r>
-      <w:r>
-        <w:br/>
-        <w:t>}</w:t>
-      </w:r>
-    </w:p>
-    <w:p>
-      <w:r>
-        <w:pict w14:anchorId="5EB36378">
-          <v:rect id="_x0000_i1101" style="width:0;height:1.5pt" o:hralign="center" o:hrstd="t" o:hr="t" fillcolor="#a0a0a0" stroked="f"/>
-        </w:pict>
-      </w:r>
-    </w:p>
-    <w:p>
-      <w:pPr>
-        <w:rPr>
-          <w:b/>
-          <w:bCs/>
-        </w:rPr>
-      </w:pPr>
-      <w:r>
-        <w:rPr>
-          <w:b/>
-          <w:bCs/>
-        </w:rPr>
-        <w:t xml:space="preserve">3.3 </w:t>
-      </w:r>
-      <w:r>
-        <w:rPr>
-          <w:rFonts w:ascii="Segoe UI Emoji" w:hAnsi="Segoe UI Emoji" w:cs="Segoe UI Emoji"/>
-          <w:b/>
-          <w:bCs/>
-        </w:rPr>
-        <w:t>🎼</w:t>
-      </w:r>
-      <w:r>
-        <w:rPr>
-          <w:b/>
-          <w:bCs/>
-        </w:rPr>
-        <w:t xml:space="preserve"> Music Mapping Engine</w:t>
-      </w:r>
-    </w:p>
-    <w:p>
-      <w:r>
-        <w:rPr>
-          <w:b/>
-          <w:bCs/>
-        </w:rPr>
-        <w:lastRenderedPageBreak/>
-        <w:t>Responsibility:</w:t>
-      </w:r>
-      <w:r>
-        <w:t xml:space="preserve"> Map gestures → musical intent</w:t>
-      </w:r>
-    </w:p>
-    <w:p>
-      <w:r>
-        <w:rPr>
-          <w:b/>
-          <w:bCs/>
-        </w:rPr>
-        <w:t>Features:</w:t>
-      </w:r>
-    </w:p>
-    <w:p>
-      <w:pPr>
-        <w:numPr>
-          <w:ilvl w:val="0"/>
-          <w:numId w:val="5"/>
-        </w:numPr>
-      </w:pPr>
-      <w:r>
-        <w:t xml:space="preserve">Note mapping (C–B) </w:t>
-      </w:r>
-    </w:p>
-    <w:p>
-      <w:pPr>
-        <w:numPr>
-          <w:ilvl w:val="0"/>
-          <w:numId w:val="5"/>
-        </w:numPr>
-      </w:pPr>
-      <w:r>
-        <w:t xml:space="preserve">Octave control </w:t>
-      </w:r>
-    </w:p>
-    <w:p>
-      <w:pPr>
-        <w:numPr>
-          <w:ilvl w:val="0"/>
-          <w:numId w:val="5"/>
-        </w:numPr>
-      </w:pPr>
-      <w:r>
-        <w:t xml:space="preserve">Instrument selection </w:t>
-      </w:r>
-    </w:p>
-    <w:p>
-      <w:r>
-        <w:rPr>
-          <w:b/>
-          <w:bCs/>
-        </w:rPr>
-        <w:t>Mapping Example:</w:t>
-      </w:r>
-    </w:p>
-    <w:p>
-      <w:r>
-        <w:t>LEFT_HAND = {</w:t>
-      </w:r>
-      <w:r>
-        <w:br/>
-        <w:t xml:space="preserve">    "index": "C",</w:t>
-      </w:r>
-      <w:r>
-        <w:br/>
-        <w:t xml:space="preserve">    "middle": "D",</w:t>
-      </w:r>
-      <w:r>
-        <w:br/>
-        <w:t xml:space="preserve">    "ring": "E",</w:t>
-      </w:r>
-      <w:r>
-        <w:br/>
-        <w:t xml:space="preserve">    "pinky": "F"</w:t>
-      </w:r>
-      <w:r>
-        <w:br/>
-        <w:t>}</w:t>
-      </w:r>
-    </w:p>
-    <w:p>
-      <w:r>
-        <w:rPr>
-          <w:b/>
-          <w:bCs/>
-        </w:rPr>
-        <w:t>Logic:</w:t>
-      </w:r>
-    </w:p>
-    <w:p>
-      <w:pPr>
-        <w:numPr>
-          <w:ilvl w:val="0"/>
-          <w:numId w:val="6"/>
-        </w:numPr>
-      </w:pPr>
-      <w:r>
-        <w:t xml:space="preserve">If finger bent → trigger note </w:t>
-      </w:r>
-    </w:p>
-    <w:p>
-      <w:pPr>
-        <w:numPr>
-          <w:ilvl w:val="0"/>
-          <w:numId w:val="6"/>
-        </w:numPr>
-      </w:pPr>
-      <w:r>
-        <w:t xml:space="preserve">Apply octave modifiers </w:t>
-      </w:r>
-    </w:p>
-    <w:p>
-      <w:pPr>
-        <w:numPr>
-          <w:ilvl w:val="0"/>
-          <w:numId w:val="6"/>
-        </w:numPr>
-      </w:pPr>
-      <w:r>
-        <w:t xml:space="preserve">Resolve conflicts (multi-finger input) </w:t>
-      </w:r>
-    </w:p>
-    <w:p>
-      <w:r>
-        <w:pict w14:anchorId="22FBDB32">
-          <v:rect id="_x0000_i1102" style="width:0;height:1.5pt" o:hralign="center" o:hrstd="t" o:hr="t" fillcolor="#a0a0a0" stroked="f"/>
-        </w:pict>
-      </w:r>
-    </w:p>
-    <w:p>
-      <w:pPr>
-        <w:rPr>
-          <w:b/>
-          <w:bCs/>
-        </w:rPr>
-      </w:pPr>
-      <w:r>
-        <w:rPr>
-          <w:b/>
-          <w:bCs/>
-        </w:rPr>
-        <w:t xml:space="preserve">3.4 </w:t>
-      </w:r>
-      <w:r>
-        <w:rPr>
-          <w:rFonts w:ascii="Segoe UI Emoji" w:hAnsi="Segoe UI Emoji" w:cs="Segoe UI Emoji"/>
-          <w:b/>
-          <w:bCs/>
-        </w:rPr>
-        <w:t>🔊</w:t>
-      </w:r>
-      <w:r>
-        <w:rPr>
-          <w:b/>
-          <w:bCs/>
-        </w:rPr>
-        <w:t xml:space="preserve"> Audio Engine</w:t>
-      </w:r>
-    </w:p>
-    <w:p>
-      <w:r>
-        <w:rPr>
-          <w:b/>
-          <w:bCs/>
-        </w:rPr>
-        <w:t>Responsibility:</w:t>
-      </w:r>
-      <w:r>
-        <w:t xml:space="preserve"> Generate/play sound</w:t>
-      </w:r>
-    </w:p>
-    <w:p>
-      <w:r>
-        <w:rPr>
-          <w:b/>
-          <w:bCs/>
-        </w:rPr>
-        <w:t>Tech Options:</w:t>
-      </w:r>
-    </w:p>
-    <w:p>
-      <w:pPr>
-        <w:numPr>
-          <w:ilvl w:val="0"/>
-          <w:numId w:val="7"/>
-        </w:numPr>
-      </w:pPr>
-      <w:r>
-        <w:t xml:space="preserve">Pygame (simple) </w:t>
-      </w:r>
-    </w:p>
-    <w:p>
-      <w:pPr>
-        <w:numPr>
-          <w:ilvl w:val="0"/>
-          <w:numId w:val="7"/>
-        </w:numPr>
-      </w:pPr>
-      <w:r>
-        <w:t xml:space="preserve">OR MIDI (recommended upgrade) </w:t>
-      </w:r>
-    </w:p>
-    <w:p>
-      <w:r>
-        <w:rPr>
-          <w:b/>
-          <w:bCs/>
-        </w:rPr>
-        <w:t>Responsibilities:</w:t>
-      </w:r>
-    </w:p>
-    <w:p>
-      <w:pPr>
-        <w:numPr>
-          <w:ilvl w:val="0"/>
-          <w:numId w:val="8"/>
-        </w:numPr>
-      </w:pPr>
-      <w:r>
-        <w:t xml:space="preserve">Load instrument sounds </w:t>
-      </w:r>
-    </w:p>
-    <w:p>
-      <w:pPr>
-        <w:numPr>
-          <w:ilvl w:val="0"/>
-          <w:numId w:val="8"/>
-        </w:numPr>
-      </w:pPr>
-      <w:r>
-        <w:t xml:space="preserve">Play/stop notes </w:t>
-      </w:r>
-    </w:p>
-    <w:p>
-      <w:pPr>
-        <w:numPr>
-          <w:ilvl w:val="0"/>
-          <w:numId w:val="8"/>
-        </w:numPr>
-      </w:pPr>
-      <w:r>
-        <w:t xml:space="preserve">Handle polyphony </w:t>
-      </w:r>
-    </w:p>
-    <w:p>
-      <w:pPr>
-        <w:numPr>
-          <w:ilvl w:val="0"/>
-          <w:numId w:val="8"/>
-        </w:numPr>
-      </w:pPr>
-      <w:r>
-        <w:t xml:space="preserve">Debounce (150ms) </w:t>
-      </w:r>
-    </w:p>
-    <w:p>
-      <w:r>
-        <w:pict w14:anchorId="3314D685">
-          <v:rect id="_x0000_i1103" style="width:0;height:1.5pt" o:hralign="center" o:hrstd="t" o:hr="t" fillcolor="#a0a0a0" stroked="f"/>
-        </w:pict>
-      </w:r>
-    </w:p>
-    <w:p>
-      <w:pPr>
-        <w:rPr>
-          <w:b/>
-          <w:bCs/>
-        </w:rPr>
-      </w:pPr>
-      <w:r>
-        <w:rPr>
-          <w:b/>
-          <w:bCs/>
-        </w:rPr>
-        <w:t xml:space="preserve">3.5 </w:t>
-      </w:r>
-      <w:r>
-        <w:rPr>
-          <w:rFonts w:ascii="Segoe UI Emoji" w:hAnsi="Segoe UI Emoji" w:cs="Segoe UI Emoji"/>
-          <w:b/>
-          <w:bCs/>
-        </w:rPr>
-        <w:t>🖥️</w:t>
-      </w:r>
-      <w:r>
-        <w:rPr>
-          <w:b/>
-          <w:bCs/>
-        </w:rPr>
-        <w:t xml:space="preserve"> UI &amp; Feedback Layer</w:t>
-      </w:r>
-    </w:p>
-    <w:p>
-      <w:r>
-        <w:rPr>
-          <w:b/>
-          <w:bCs/>
-        </w:rPr>
-        <w:lastRenderedPageBreak/>
-        <w:t>Responsibility:</w:t>
-      </w:r>
-      <w:r>
-        <w:t xml:space="preserve"> Visual feedback for usability</w:t>
-      </w:r>
-    </w:p>
-    <w:p>
-      <w:r>
-        <w:rPr>
-          <w:b/>
-          <w:bCs/>
-        </w:rPr>
-        <w:t>Features:</w:t>
-      </w:r>
-    </w:p>
-    <w:p>
-      <w:pPr>
-        <w:numPr>
-          <w:ilvl w:val="0"/>
-          <w:numId w:val="9"/>
-        </w:numPr>
-      </w:pPr>
-      <w:r>
-        <w:t xml:space="preserve">Landmark overlay </w:t>
-      </w:r>
-    </w:p>
-    <w:p>
-      <w:pPr>
-        <w:numPr>
-          <w:ilvl w:val="0"/>
-          <w:numId w:val="9"/>
-        </w:numPr>
-      </w:pPr>
-      <w:r>
-        <w:t xml:space="preserve">Finger state color coding </w:t>
-      </w:r>
-    </w:p>
-    <w:p>
-      <w:pPr>
-        <w:numPr>
-          <w:ilvl w:val="0"/>
-          <w:numId w:val="9"/>
-        </w:numPr>
-      </w:pPr>
-      <w:r>
-        <w:t xml:space="preserve">Current instrument display </w:t>
-      </w:r>
-    </w:p>
-    <w:p>
-      <w:pPr>
-        <w:numPr>
-          <w:ilvl w:val="0"/>
-          <w:numId w:val="9"/>
-        </w:numPr>
-      </w:pPr>
-      <w:r>
-        <w:t xml:space="preserve">Active notes visualization </w:t>
-      </w:r>
-    </w:p>
-    <w:p>
-      <w:r>
-        <w:pict w14:anchorId="41767F7D">
-          <v:rect id="_x0000_i1104" style="width:0;height:1.5pt" o:hralign="center" o:hrstd="t" o:hr="t" fillcolor="#a0a0a0" stroked="f"/>
-        </w:pict>
-      </w:r>
-    </w:p>
-    <w:p>
-      <w:pPr>
-        <w:rPr>
-          <w:b/>
-          <w:bCs/>
-        </w:rPr>
-      </w:pPr>
-      <w:r>
-        <w:rPr>
-          <w:b/>
-          <w:bCs/>
-        </w:rPr>
-        <w:t xml:space="preserve">4. </w:t>
-      </w:r>
-      <w:r>
-        <w:rPr>
-          <w:rFonts w:ascii="Segoe UI Emoji" w:hAnsi="Segoe UI Emoji" w:cs="Segoe UI Emoji"/>
-          <w:b/>
-          <w:bCs/>
-        </w:rPr>
-        <w:t>🔄</w:t>
-      </w:r>
-      <w:r>
-        <w:rPr>
-          <w:b/>
-          <w:bCs/>
-        </w:rPr>
-        <w:t xml:space="preserve"> Data Flow (Step-by-Step)</w:t>
-      </w:r>
-    </w:p>
-    <w:p>
-      <w:pPr>
-        <w:numPr>
-          <w:ilvl w:val="0"/>
-          <w:numId w:val="10"/>
-        </w:numPr>
-      </w:pPr>
-      <w:r>
-        <w:t xml:space="preserve">Webcam captures frame </w:t>
-      </w:r>
-    </w:p>
-    <w:p>
-      <w:pPr>
-        <w:numPr>
-          <w:ilvl w:val="0"/>
-          <w:numId w:val="10"/>
-        </w:numPr>
-      </w:pPr>
-      <w:r>
-        <w:t xml:space="preserve">Vision module extracts hand landmarks </w:t>
-      </w:r>
-    </w:p>
-    <w:p>
-      <w:pPr>
-        <w:numPr>
-          <w:ilvl w:val="0"/>
-          <w:numId w:val="10"/>
-        </w:numPr>
-      </w:pPr>
-      <w:r>
-        <w:t xml:space="preserve">Gesture engine determines: </w:t>
-      </w:r>
-    </w:p>
-    <w:p>
-      <w:pPr>
-        <w:numPr>
-          <w:ilvl w:val="1"/>
-          <w:numId w:val="10"/>
-        </w:numPr>
-      </w:pPr>
-      <w:r>
-        <w:t xml:space="preserve">Finger states </w:t>
-      </w:r>
-    </w:p>
-    <w:p>
-      <w:pPr>
-        <w:numPr>
-          <w:ilvl w:val="1"/>
-          <w:numId w:val="10"/>
-        </w:numPr>
-      </w:pPr>
-      <w:r>
-        <w:t xml:space="preserve">Swipes </w:t>
-      </w:r>
-    </w:p>
-    <w:p>
-      <w:pPr>
-        <w:numPr>
-          <w:ilvl w:val="0"/>
-          <w:numId w:val="10"/>
-        </w:numPr>
-      </w:pPr>
-      <w:r>
-        <w:t xml:space="preserve">Music engine maps gestures → notes </w:t>
-      </w:r>
-    </w:p>
-    <w:p>
-      <w:pPr>
-        <w:numPr>
-          <w:ilvl w:val="0"/>
-          <w:numId w:val="10"/>
-        </w:numPr>
-      </w:pPr>
-      <w:r>
-        <w:t xml:space="preserve">Audio engine plays sound </w:t>
-      </w:r>
-    </w:p>
-    <w:p>
-      <w:pPr>
-        <w:numPr>
-          <w:ilvl w:val="0"/>
-          <w:numId w:val="10"/>
-        </w:numPr>
-      </w:pPr>
-      <w:r>
-        <w:t xml:space="preserve">UI overlays feedback </w:t>
-      </w:r>
-    </w:p>
-    <w:p>
-      <w:r>
-        <w:pict w14:anchorId="7A05A9B6">
-          <v:rect id="_x0000_i1105" style="width:0;height:1.5pt" o:hralign="center" o:hrstd="t" o:hr="t" fillcolor="#a0a0a0" stroked="f"/>
-        </w:pict>
-      </w:r>
-    </w:p>
-    <w:p>
-      <w:pPr>
-        <w:rPr>
-          <w:b/>
-          <w:bCs/>
-        </w:rPr>
-      </w:pPr>
-      <w:r>
-        <w:rPr>
-          <w:b/>
-          <w:bCs/>
-        </w:rPr>
-        <w:t xml:space="preserve">5. </w:t>
-      </w:r>
-      <w:r>
-        <w:rPr>
-          <w:rFonts w:ascii="Segoe UI Emoji" w:hAnsi="Segoe UI Emoji" w:cs="Segoe UI Emoji"/>
-          <w:b/>
-          <w:bCs/>
-        </w:rPr>
-        <w:t>⚙️</w:t>
-      </w:r>
-      <w:r>
-        <w:rPr>
-          <w:b/>
-          <w:bCs/>
-        </w:rPr>
-        <w:t xml:space="preserve"> Key Design Decisions</w:t>
-      </w:r>
-    </w:p>
-    <w:p>
-      <w:pPr>
-        <w:rPr>
-          <w:b/>
-          <w:bCs/>
-        </w:rPr>
-      </w:pPr>
-      <w:r>
-        <w:rPr>
-          <w:rFonts w:ascii="Segoe UI Emoji" w:hAnsi="Segoe UI Emoji" w:cs="Segoe UI Emoji"/>
-          <w:b/>
-          <w:bCs/>
-        </w:rPr>
-        <w:t>✅</w:t>
-      </w:r>
-      <w:r>
-        <w:rPr>
-          <w:b/>
-          <w:bCs/>
-        </w:rPr>
-        <w:t xml:space="preserve"> Modular Architecture</w:t>
-      </w:r>
-    </w:p>
-    <w:p>
-      <w:r>
-        <w:t>Each module is independent → easier debugging + scaling</w:t>
-      </w:r>
-    </w:p>
-    <w:p>
-      <w:pPr>
-        <w:rPr>
-          <w:b/>
-          <w:bCs/>
-        </w:rPr>
-      </w:pPr>
-      <w:r>
-        <w:rPr>
-          <w:rFonts w:ascii="Segoe UI Emoji" w:hAnsi="Segoe UI Emoji" w:cs="Segoe UI Emoji"/>
-          <w:b/>
-          <w:bCs/>
-        </w:rPr>
-        <w:t>✅</w:t>
-      </w:r>
-      <w:r>
-        <w:rPr>
-          <w:b/>
-          <w:bCs/>
-        </w:rPr>
-        <w:t xml:space="preserve"> Stateless Frame Processing</w:t>
-      </w:r>
-    </w:p>
-    <w:p>
-      <w:r>
-        <w:t>Avoid long dependencies → reduces latency</w:t>
-      </w:r>
-    </w:p>
-    <w:p>
-      <w:pPr>
-        <w:rPr>
-          <w:b/>
-          <w:bCs/>
-        </w:rPr>
-      </w:pPr>
-      <w:r>
-        <w:rPr>
-          <w:rFonts w:ascii="Segoe UI Emoji" w:hAnsi="Segoe UI Emoji" w:cs="Segoe UI Emoji"/>
-          <w:b/>
-          <w:bCs/>
-        </w:rPr>
-        <w:t>✅</w:t>
-      </w:r>
-      <w:r>
-        <w:rPr>
-          <w:b/>
-          <w:bCs/>
-        </w:rPr>
-        <w:t xml:space="preserve"> Event-Based Triggers</w:t>
-      </w:r>
-    </w:p>
-    <w:p>
-      <w:pPr>
-        <w:numPr>
-          <w:ilvl w:val="0"/>
-          <w:numId w:val="11"/>
-        </w:numPr>
-      </w:pPr>
-      <w:r>
-        <w:t xml:space="preserve">Finger bent → event </w:t>
-      </w:r>
-    </w:p>
-    <w:p>
-      <w:pPr>
-        <w:numPr>
-          <w:ilvl w:val="0"/>
-          <w:numId w:val="11"/>
-        </w:numPr>
-      </w:pPr>
-      <w:r>
-        <w:t xml:space="preserve">Swipe → event </w:t>
-      </w:r>
-    </w:p>
-    <w:p>
-      <w:pPr>
-        <w:numPr>
-          <w:ilvl w:val="0"/>
-          <w:numId w:val="11"/>
-        </w:numPr>
-      </w:pPr>
-      <w:r>
-        <w:t xml:space="preserve">Prevent continuous retriggering </w:t>
-      </w:r>
-    </w:p>
-    <w:p>
-      <w:r>
-        <w:pict w14:anchorId="464C9A03">
-          <v:rect id="_x0000_i1106" style="width:0;height:1.5pt" o:hralign="center" o:hrstd="t" o:hr="t" fillcolor="#a0a0a0" stroked="f"/>
-        </w:pict>
-      </w:r>
-    </w:p>
-    <w:p>
-      <w:pPr>
-        <w:rPr>
-          <w:b/>
-          <w:bCs/>
-        </w:rPr>
-      </w:pPr>
-      <w:r>
-        <w:rPr>
-          <w:b/>
-          <w:bCs/>
-        </w:rPr>
-        <w:lastRenderedPageBreak/>
-        <w:t xml:space="preserve">6. </w:t>
-      </w:r>
-      <w:r>
-        <w:rPr>
-          <w:rFonts w:ascii="Segoe UI Emoji" w:hAnsi="Segoe UI Emoji" w:cs="Segoe UI Emoji"/>
-          <w:b/>
-          <w:bCs/>
-        </w:rPr>
-        <w:t>📂</w:t>
-      </w:r>
-      <w:r>
-        <w:rPr>
-          <w:b/>
-          <w:bCs/>
-        </w:rPr>
-        <w:t xml:space="preserve"> Suggested Folder Structure</w:t>
-      </w:r>
-    </w:p>
-    <w:p>
-      <w:r>
-        <w:t>project/</w:t>
-      </w:r>
-      <w:r>
-        <w:br/>
-        <w:t>│</w:t>
-      </w:r>
-      <w:r>
-        <w:br/>
-      </w:r>
-      <w:r>
-        <w:rPr>
-          <w:rFonts w:ascii="MS Gothic" w:eastAsia="MS Gothic" w:hAnsi="MS Gothic" w:cs="MS Gothic" w:hint="eastAsia"/>
-        </w:rPr>
-        <w:t>├</w:t>
-      </w:r>
-      <w:r>
-        <w:rPr>
-          <w:rFonts w:ascii="Aptos" w:hAnsi="Aptos" w:cs="Aptos"/>
-        </w:rPr>
-        <w:t>──</w:t>
-      </w:r>
-      <w:r>
-        <w:t xml:space="preserve"> main.py</w:t>
-      </w:r>
-      <w:r>
-        <w:br/>
-      </w:r>
-      <w:r>
-        <w:rPr>
-          <w:rFonts w:ascii="MS Gothic" w:eastAsia="MS Gothic" w:hAnsi="MS Gothic" w:cs="MS Gothic" w:hint="eastAsia"/>
-        </w:rPr>
-        <w:t>├</w:t>
-      </w:r>
-      <w:r>
-        <w:rPr>
-          <w:rFonts w:ascii="Aptos" w:hAnsi="Aptos" w:cs="Aptos"/>
-        </w:rPr>
-        <w:t>──</w:t>
-      </w:r>
-      <w:r>
-        <w:t xml:space="preserve"> config.py</w:t>
-      </w:r>
-      <w:r>
-        <w:br/>
-      </w:r>
-      <w:r>
-        <w:rPr>
-          <w:rFonts w:ascii="Aptos" w:hAnsi="Aptos" w:cs="Aptos"/>
-        </w:rPr>
-        <w:t>│</w:t>
-      </w:r>
-      <w:r>
-        <w:br/>
-      </w:r>
-      <w:r>
-        <w:rPr>
-          <w:rFonts w:ascii="MS Gothic" w:eastAsia="MS Gothic" w:hAnsi="MS Gothic" w:cs="MS Gothic" w:hint="eastAsia"/>
-        </w:rPr>
-        <w:t>├</w:t>
-      </w:r>
-      <w:r>
-        <w:rPr>
-          <w:rFonts w:ascii="Aptos" w:hAnsi="Aptos" w:cs="Aptos"/>
-        </w:rPr>
-        <w:t>──</w:t>
-      </w:r>
-      <w:r>
-        <w:t xml:space="preserve"> vision/</w:t>
-      </w:r>
-      <w:r>
-        <w:br/>
-      </w:r>
-      <w:r>
-        <w:rPr>
-          <w:rFonts w:ascii="Aptos" w:hAnsi="Aptos" w:cs="Aptos"/>
-        </w:rPr>
-        <w:t>│</w:t>
-      </w:r>
-      <w:r>
-        <w:t xml:space="preserve">   </w:t>
-      </w:r>
-      <w:r>
-        <w:rPr>
-          <w:rFonts w:ascii="MS Gothic" w:eastAsia="MS Gothic" w:hAnsi="MS Gothic" w:cs="MS Gothic" w:hint="eastAsia"/>
-        </w:rPr>
-        <w:t>├</w:t>
-      </w:r>
-      <w:r>
-        <w:rPr>
-          <w:rFonts w:ascii="Aptos" w:hAnsi="Aptos" w:cs="Aptos"/>
-        </w:rPr>
-        <w:t>──</w:t>
-      </w:r>
-      <w:r>
-        <w:t xml:space="preserve"> hand_tracker.py</w:t>
-      </w:r>
-      <w:r>
-        <w:br/>
-      </w:r>
-      <w:r>
-        <w:rPr>
-          <w:rFonts w:ascii="Aptos" w:hAnsi="Aptos" w:cs="Aptos"/>
-        </w:rPr>
-        <w:t>│</w:t>
-      </w:r>
-      <w:r>
-        <w:t xml:space="preserve">   </w:t>
-      </w:r>
-      <w:r>
-        <w:rPr>
-          <w:rFonts w:ascii="Aptos" w:hAnsi="Aptos" w:cs="Aptos"/>
-        </w:rPr>
-        <w:t>└──</w:t>
-      </w:r>
-      <w:r>
-        <w:t xml:space="preserve"> camera.py</w:t>
-      </w:r>
-      <w:r>
-        <w:br/>
-      </w:r>
-      <w:r>
-        <w:rPr>
-          <w:rFonts w:ascii="Aptos" w:hAnsi="Aptos" w:cs="Aptos"/>
-        </w:rPr>
-        <w:t>│</w:t>
-      </w:r>
-      <w:r>
-        <w:br/>
-      </w:r>
-      <w:r>
-        <w:rPr>
-          <w:rFonts w:ascii="MS Gothic" w:eastAsia="MS Gothic" w:hAnsi="MS Gothic" w:cs="MS Gothic" w:hint="eastAsia"/>
-        </w:rPr>
-        <w:t>├</w:t>
-      </w:r>
-      <w:r>
-        <w:rPr>
-          <w:rFonts w:ascii="Aptos" w:hAnsi="Aptos" w:cs="Aptos"/>
-        </w:rPr>
-        <w:t>──</w:t>
-      </w:r>
-      <w:r>
-        <w:t xml:space="preserve"> gesture/</w:t>
-      </w:r>
-      <w:r>
-        <w:br/>
-      </w:r>
-      <w:r>
-        <w:rPr>
-          <w:rFonts w:ascii="Aptos" w:hAnsi="Aptos" w:cs="Aptos"/>
-        </w:rPr>
-        <w:t>│</w:t>
-      </w:r>
-      <w:r>
-        <w:t xml:space="preserve">   </w:t>
-      </w:r>
-      <w:r>
-        <w:rPr>
-          <w:rFonts w:ascii="MS Gothic" w:eastAsia="MS Gothic" w:hAnsi="MS Gothic" w:cs="MS Gothic" w:hint="eastAsia"/>
-        </w:rPr>
-        <w:t>├</w:t>
-      </w:r>
-      <w:r>
-        <w:rPr>
-          <w:rFonts w:ascii="Aptos" w:hAnsi="Aptos" w:cs="Aptos"/>
-        </w:rPr>
-        <w:t>──</w:t>
-      </w:r>
-      <w:r>
-        <w:t xml:space="preserve"> finger_detector.py</w:t>
-      </w:r>
-      <w:r>
-        <w:br/>
-      </w:r>
-      <w:r>
-        <w:rPr>
-          <w:rFonts w:ascii="Aptos" w:hAnsi="Aptos" w:cs="Aptos"/>
-        </w:rPr>
-        <w:t>│</w:t>
-      </w:r>
-      <w:r>
-        <w:t xml:space="preserve">   </w:t>
-      </w:r>
-      <w:r>
-        <w:rPr>
-          <w:rFonts w:ascii="MS Gothic" w:eastAsia="MS Gothic" w:hAnsi="MS Gothic" w:cs="MS Gothic" w:hint="eastAsia"/>
-        </w:rPr>
-        <w:t>├</w:t>
-      </w:r>
-      <w:r>
-        <w:rPr>
-          <w:rFonts w:ascii="Aptos" w:hAnsi="Aptos" w:cs="Aptos"/>
-        </w:rPr>
-        <w:t>──</w:t>
-      </w:r>
-      <w:r>
-        <w:t xml:space="preserve"> gesture_logic.py</w:t>
-      </w:r>
-      <w:r>
-        <w:br/>
-      </w:r>
-      <w:r>
-        <w:rPr>
-          <w:rFonts w:ascii="Aptos" w:hAnsi="Aptos" w:cs="Aptos"/>
-        </w:rPr>
-        <w:t>│</w:t>
-      </w:r>
-      <w:r>
-        <w:t xml:space="preserve">   </w:t>
-      </w:r>
-      <w:r>
-        <w:rPr>
-          <w:rFonts w:ascii="Aptos" w:hAnsi="Aptos" w:cs="Aptos"/>
-        </w:rPr>
-        <w:t>└──</w:t>
-      </w:r>
-      <w:r>
-        <w:t xml:space="preserve"> swipe_detector.py</w:t>
-      </w:r>
-      <w:r>
-        <w:br/>
-      </w:r>
-      <w:r>
-        <w:rPr>
-          <w:rFonts w:ascii="Aptos" w:hAnsi="Aptos" w:cs="Aptos"/>
-        </w:rPr>
-        <w:t>│</w:t>
-      </w:r>
-      <w:r>
-        <w:br/>
-      </w:r>
-      <w:r>
-        <w:rPr>
-          <w:rFonts w:ascii="MS Gothic" w:eastAsia="MS Gothic" w:hAnsi="MS Gothic" w:cs="MS Gothic" w:hint="eastAsia"/>
-        </w:rPr>
-        <w:t>├</w:t>
-      </w:r>
-      <w:r>
-        <w:rPr>
-          <w:rFonts w:ascii="Aptos" w:hAnsi="Aptos" w:cs="Aptos"/>
-        </w:rPr>
-        <w:t>──</w:t>
-      </w:r>
-      <w:r>
-        <w:t xml:space="preserve"> music/</w:t>
-      </w:r>
-      <w:r>
-        <w:br/>
-      </w:r>
-      <w:r>
-        <w:rPr>
-          <w:rFonts w:ascii="Aptos" w:hAnsi="Aptos" w:cs="Aptos"/>
-        </w:rPr>
-        <w:t>│</w:t>
-      </w:r>
-      <w:r>
-        <w:t xml:space="preserve">   </w:t>
-      </w:r>
-      <w:r>
-        <w:rPr>
-          <w:rFonts w:ascii="MS Gothic" w:eastAsia="MS Gothic" w:hAnsi="MS Gothic" w:cs="MS Gothic" w:hint="eastAsia"/>
-        </w:rPr>
-        <w:t>├</w:t>
-      </w:r>
-      <w:r>
-        <w:rPr>
-          <w:rFonts w:ascii="Aptos" w:hAnsi="Aptos" w:cs="Aptos"/>
-        </w:rPr>
-        <w:t>──</w:t>
-      </w:r>
-      <w:r>
-        <w:t xml:space="preserve"> note_mapper.py</w:t>
-      </w:r>
-      <w:r>
-        <w:br/>
-      </w:r>
-      <w:r>
-        <w:rPr>
-          <w:rFonts w:ascii="Aptos" w:hAnsi="Aptos" w:cs="Aptos"/>
-        </w:rPr>
-        <w:t>│</w:t>
-      </w:r>
-      <w:r>
-        <w:t xml:space="preserve">   </w:t>
-      </w:r>
-      <w:r>
-        <w:rPr>
-          <w:rFonts w:ascii="MS Gothic" w:eastAsia="MS Gothic" w:hAnsi="MS Gothic" w:cs="MS Gothic" w:hint="eastAsia"/>
-        </w:rPr>
-        <w:t>├</w:t>
-      </w:r>
-      <w:r>
-        <w:rPr>
-          <w:rFonts w:ascii="Aptos" w:hAnsi="Aptos" w:cs="Aptos"/>
-        </w:rPr>
-        <w:t>──</w:t>
-      </w:r>
-      <w:r>
-        <w:t xml:space="preserve"> instrument_manager.py</w:t>
-      </w:r>
-      <w:r>
-        <w:br/>
-      </w:r>
-      <w:r>
-        <w:rPr>
-          <w:rFonts w:ascii="Aptos" w:hAnsi="Aptos" w:cs="Aptos"/>
-        </w:rPr>
-        <w:t>│</w:t>
-      </w:r>
-      <w:r>
-        <w:t xml:space="preserve">   </w:t>
-      </w:r>
-      <w:r>
-        <w:rPr>
-          <w:rFonts w:ascii="Aptos" w:hAnsi="Aptos" w:cs="Aptos"/>
-        </w:rPr>
-        <w:t>└──</w:t>
-      </w:r>
-      <w:r>
-        <w:t xml:space="preserve"> scale_config.py</w:t>
-      </w:r>
-      <w:r>
-        <w:br/>
-      </w:r>
-      <w:r>
-        <w:rPr>
-          <w:rFonts w:ascii="Aptos" w:hAnsi="Aptos" w:cs="Aptos"/>
-        </w:rPr>
-        <w:t>│</w:t>
-      </w:r>
-      <w:r>
-        <w:br/>
-      </w:r>
-      <w:r>
-        <w:rPr>
-          <w:rFonts w:ascii="MS Gothic" w:eastAsia="MS Gothic" w:hAnsi="MS Gothic" w:cs="MS Gothic" w:hint="eastAsia"/>
-        </w:rPr>
-        <w:t>├</w:t>
-      </w:r>
-      <w:r>
-        <w:rPr>
-          <w:rFonts w:ascii="Aptos" w:hAnsi="Aptos" w:cs="Aptos"/>
-        </w:rPr>
-        <w:t>──</w:t>
-      </w:r>
-      <w:r>
-        <w:t xml:space="preserve"> audio/</w:t>
-      </w:r>
-      <w:r>
-        <w:br/>
-      </w:r>
-      <w:r>
-        <w:rPr>
-          <w:rFonts w:ascii="Aptos" w:hAnsi="Aptos" w:cs="Aptos"/>
-        </w:rPr>
-        <w:t>│</w:t>
-      </w:r>
-      <w:r>
-        <w:t xml:space="preserve">   </w:t>
-      </w:r>
-      <w:r>
-        <w:rPr>
-          <w:rFonts w:ascii="MS Gothic" w:eastAsia="MS Gothic" w:hAnsi="MS Gothic" w:cs="MS Gothic" w:hint="eastAsia"/>
-        </w:rPr>
-        <w:t>├</w:t>
-      </w:r>
-      <w:r>
-        <w:rPr>
-          <w:rFonts w:ascii="Aptos" w:hAnsi="Aptos" w:cs="Aptos"/>
-        </w:rPr>
-        <w:t>──</w:t>
-      </w:r>
-      <w:r>
-        <w:t xml:space="preserve"> audio_engine.py</w:t>
-      </w:r>
-      <w:r>
-        <w:br/>
-      </w:r>
-      <w:r>
-        <w:rPr>
-          <w:rFonts w:ascii="Aptos" w:hAnsi="Aptos" w:cs="Aptos"/>
-        </w:rPr>
-        <w:t>│</w:t>
-      </w:r>
-      <w:r>
-        <w:t xml:space="preserve">   </w:t>
-      </w:r>
-      <w:r>
-        <w:rPr>
-          <w:rFonts w:ascii="Aptos" w:hAnsi="Aptos" w:cs="Aptos"/>
-        </w:rPr>
-        <w:t>└──</w:t>
-      </w:r>
-      <w:r>
-        <w:t xml:space="preserve"> sound_loader.py</w:t>
-      </w:r>
-      <w:r>
-        <w:br/>
-      </w:r>
-      <w:r>
-        <w:rPr>
-          <w:rFonts w:ascii="Aptos" w:hAnsi="Aptos" w:cs="Aptos"/>
-        </w:rPr>
-        <w:t>│</w:t>
-      </w:r>
-      <w:r>
-        <w:br/>
-      </w:r>
-      <w:r>
-        <w:rPr>
-          <w:rFonts w:ascii="MS Gothic" w:eastAsia="MS Gothic" w:hAnsi="MS Gothic" w:cs="MS Gothic" w:hint="eastAsia"/>
-        </w:rPr>
-        <w:t>├</w:t>
-      </w:r>
-      <w:r>
-        <w:rPr>
-          <w:rFonts w:ascii="Aptos" w:hAnsi="Aptos" w:cs="Aptos"/>
-        </w:rPr>
-        <w:t>──</w:t>
-      </w:r>
-      <w:r>
-        <w:t xml:space="preserve"> ui/</w:t>
-      </w:r>
-      <w:r>
-        <w:br/>
-      </w:r>
-      <w:r>
-        <w:rPr>
-          <w:rFonts w:ascii="Aptos" w:hAnsi="Aptos" w:cs="Aptos"/>
-        </w:rPr>
-        <w:t>│</w:t>
-      </w:r>
-      <w:r>
-        <w:t xml:space="preserve">   </w:t>
-      </w:r>
-      <w:r>
-        <w:rPr>
-          <w:rFonts w:ascii="MS Gothic" w:eastAsia="MS Gothic" w:hAnsi="MS Gothic" w:cs="MS Gothic" w:hint="eastAsia"/>
-        </w:rPr>
-        <w:t>├</w:t>
-      </w:r>
-      <w:r>
-        <w:rPr>
-          <w:rFonts w:ascii="Aptos" w:hAnsi="Aptos" w:cs="Aptos"/>
-        </w:rPr>
-        <w:t>──</w:t>
-      </w:r>
-      <w:r>
-        <w:t xml:space="preserve"> overlay.py</w:t>
-      </w:r>
-      <w:r>
-        <w:br/>
-      </w:r>
-      <w:r>
-        <w:rPr>
-          <w:rFonts w:ascii="Aptos" w:hAnsi="Aptos" w:cs="Aptos"/>
-        </w:rPr>
-        <w:t>│</w:t>
-      </w:r>
-      <w:r>
-        <w:t xml:space="preserve">   </w:t>
-      </w:r>
-      <w:r>
-        <w:rPr>
-          <w:rFonts w:ascii="Aptos" w:hAnsi="Aptos" w:cs="Aptos"/>
-        </w:rPr>
-        <w:t>└──</w:t>
-      </w:r>
-      <w:r>
-        <w:t xml:space="preserve"> visualizer.py</w:t>
-      </w:r>
-      <w:r>
-        <w:br/>
-      </w:r>
-      <w:r>
-        <w:rPr>
-          <w:rFonts w:ascii="Aptos" w:hAnsi="Aptos" w:cs="Aptos"/>
-        </w:rPr>
-        <w:t>│</w:t>
-      </w:r>
-      <w:r>
-        <w:br/>
-      </w:r>
-      <w:r>
-        <w:rPr>
-          <w:rFonts w:ascii="Aptos" w:hAnsi="Aptos" w:cs="Aptos"/>
-        </w:rPr>
-        <w:t>└──</w:t>
-      </w:r>
-      <w:r>
-        <w:t xml:space="preserve"> utils/</w:t>
-      </w:r>
-      <w:r>
-        <w:br/>
-        <w:t xml:space="preserve">    </w:t>
-      </w:r>
-      <w:r>
-        <w:rPr>
-          <w:rFonts w:ascii="MS Gothic" w:eastAsia="MS Gothic" w:hAnsi="MS Gothic" w:cs="MS Gothic" w:hint="eastAsia"/>
-        </w:rPr>
-        <w:t>├</w:t>
-      </w:r>
-      <w:r>
-        <w:rPr>
-          <w:rFonts w:ascii="Aptos" w:hAnsi="Aptos" w:cs="Aptos"/>
-        </w:rPr>
-        <w:t>──</w:t>
-      </w:r>
-      <w:r>
-        <w:t xml:space="preserve"> debounce.py</w:t>
-      </w:r>
-      <w:r>
-        <w:br/>
-        <w:t xml:space="preserve">    </w:t>
-      </w:r>
-      <w:r>
-        <w:rPr>
-          <w:rFonts w:ascii="Aptos" w:hAnsi="Aptos" w:cs="Aptos"/>
-        </w:rPr>
-        <w:t>└──</w:t>
-      </w:r>
-      <w:r>
-        <w:t xml:space="preserve"> logger.py</w:t>
-      </w:r>
-    </w:p>
-    <w:p>
-      <w:r>
-        <w:pict w14:anchorId="03BD3857">
-          <v:rect id="_x0000_i1107" style="width:0;height:1.5pt" o:hralign="center" o:hrstd="t" o:hr="t" fillcolor="#a0a0a0" stroked="f"/>
-        </w:pict>
-      </w:r>
-    </w:p>
-    <w:p>
-      <w:pPr>
-        <w:rPr>
-          <w:b/>
-          <w:bCs/>
-        </w:rPr>
-      </w:pPr>
-      <w:r>
-        <w:rPr>
-          <w:b/>
-          <w:bCs/>
-        </w:rPr>
-        <w:t xml:space="preserve">7. </w:t>
-      </w:r>
-      <w:r>
-        <w:rPr>
-          <w:rFonts w:ascii="Segoe UI Emoji" w:hAnsi="Segoe UI Emoji" w:cs="Segoe UI Emoji"/>
-          <w:b/>
-          <w:bCs/>
-        </w:rPr>
-        <w:t>🚀</w:t>
-      </w:r>
-      <w:r>
-        <w:rPr>
-          <w:b/>
-          <w:bCs/>
-        </w:rPr>
-        <w:t xml:space="preserve"> Performance Considerations</w:t>
-      </w:r>
-    </w:p>
-    <w:p>
-      <w:pPr>
-        <w:rPr>
-          <w:b/>
-          <w:bCs/>
-        </w:rPr>
-      </w:pPr>
-      <w:r>
-        <w:rPr>
-          <w:b/>
-          <w:bCs/>
-        </w:rPr>
-        <w:t>Latency Optimization</w:t>
-      </w:r>
-    </w:p>
-    <w:p>
-      <w:pPr>
-        <w:numPr>
-          <w:ilvl w:val="0"/>
-          <w:numId w:val="12"/>
-        </w:numPr>
-      </w:pPr>
-      <w:r>
-        <w:t xml:space="preserve">Use lower resolution frames (e.g., 640x480) </w:t>
-      </w:r>
-    </w:p>
-    <w:p>
-      <w:pPr>
-        <w:numPr>
-          <w:ilvl w:val="0"/>
-          <w:numId w:val="12"/>
-        </w:numPr>
-      </w:pPr>
-      <w:r>
-        <w:t xml:space="preserve">Limit FPS to ~30 </w:t>
-      </w:r>
-    </w:p>
-    <w:p>
-      <w:pPr>
-        <w:numPr>
-          <w:ilvl w:val="0"/>
-          <w:numId w:val="12"/>
-        </w:numPr>
-      </w:pPr>
-      <w:r>
-        <w:lastRenderedPageBreak/>
-        <w:t xml:space="preserve">Avoid blocking audio calls </w:t>
-      </w:r>
-    </w:p>
-    <w:p>
-      <w:pPr>
-        <w:rPr>
-          <w:b/>
-          <w:bCs/>
-        </w:rPr>
-      </w:pPr>
-      <w:r>
-        <w:rPr>
-          <w:b/>
-          <w:bCs/>
-        </w:rPr>
-        <w:t>Stability</w:t>
-      </w:r>
-    </w:p>
-    <w:p>
-      <w:pPr>
-        <w:numPr>
-          <w:ilvl w:val="0"/>
-          <w:numId w:val="13"/>
-        </w:numPr>
-      </w:pPr>
-      <w:r>
-        <w:t xml:space="preserve">Add smoothing to landmark movement </w:t>
-      </w:r>
-    </w:p>
-    <w:p>
-      <w:pPr>
-        <w:numPr>
-          <w:ilvl w:val="0"/>
-          <w:numId w:val="13"/>
-        </w:numPr>
-      </w:pPr>
-      <w:r>
-        <w:t xml:space="preserve">Threshold-based detection (avoid jitter) </w:t>
-      </w:r>
-    </w:p>
-    <w:p>
-      <w:r>
-        <w:pict w14:anchorId="0D270D84">
-          <v:rect id="_x0000_i1108" style="width:0;height:1.5pt" o:hralign="center" o:hrstd="t" o:hr="t" fillcolor="#a0a0a0" stroked="f"/>
-        </w:pict>
-      </w:r>
-    </w:p>
-    <w:p>
-      <w:pPr>
-        <w:rPr>
-          <w:b/>
-          <w:bCs/>
-        </w:rPr>
-      </w:pPr>
-      <w:r>
-        <w:rPr>
-          <w:b/>
-          <w:bCs/>
-        </w:rPr>
-        <w:t xml:space="preserve">8. </w:t>
-      </w:r>
-      <w:r>
-        <w:rPr>
-          <w:rFonts w:ascii="Segoe UI Emoji" w:hAnsi="Segoe UI Emoji" w:cs="Segoe UI Emoji"/>
-          <w:b/>
-          <w:bCs/>
-        </w:rPr>
-        <w:t>🧪</w:t>
-      </w:r>
-      <w:r>
-        <w:rPr>
-          <w:b/>
-          <w:bCs/>
-        </w:rPr>
-        <w:t xml:space="preserve"> Edge Cases &amp; Handling</w:t>
-      </w:r>
-    </w:p>
-    <w:tbl>
-      <w:tblPr>
-        <w:tblW w:w="0" w:type="auto"/>
-        <w:tblCellSpacing w:w="15" w:type="dxa"/>
-        <w:tblCellMar>
-          <w:top w:w="15" w:type="dxa"/>
-          <w:left w:w="15" w:type="dxa"/>
-          <w:bottom w:w="15" w:type="dxa"/>
-          <w:right w:w="15" w:type="dxa"/>
-        </w:tblCellMar>
-        <w:tblLook w:val="04A0" w:firstRow="1" w:lastRow="0" w:firstColumn="1" w:lastColumn="0" w:noHBand="0" w:noVBand="1"/>
-      </w:tblPr>
-      <w:tblGrid>
-        <w:gridCol w:w="2739"/>
-        <w:gridCol w:w="2623"/>
-      </w:tblGrid>
-      <w:tr>
-        <w:trPr>
-          <w:tblHeader/>
-          <w:tblCellSpacing w:w="15" w:type="dxa"/>
-        </w:trPr>
-        <w:tc>
-          <w:tcPr>
-            <w:tcW w:w="0" w:type="auto"/>
-            <w:vAlign w:val="center"/>
-            <w:hideMark/>
-          </w:tcPr>
-          <w:p>
-            <w:pPr>
-              <w:rPr>
-                <w:b/>
-                <w:bCs/>
-              </w:rPr>
-            </w:pPr>
-            <w:r>
-              <w:rPr>
-                <w:b/>
-                <w:bCs/>
-              </w:rPr>
-              <w:t>Issue</w:t>
-            </w:r>
-          </w:p>
-        </w:tc>
-        <w:tc>
-          <w:tcPr>
-            <w:tcW w:w="0" w:type="auto"/>
-            <w:vAlign w:val="center"/>
-            <w:hideMark/>
-          </w:tcPr>
-          <w:p>
-            <w:pPr>
-              <w:rPr>
-                <w:b/>
-                <w:bCs/>
-              </w:rPr>
-            </w:pPr>
-            <w:r>
-              <w:rPr>
-                <w:b/>
-                <w:bCs/>
-              </w:rPr>
-              <w:t>Solution</w:t>
-            </w:r>
-          </w:p>
-        </w:tc>
-      </w:tr>
-      <w:tr>
-        <w:trPr>
-          <w:tblCellSpacing w:w="15" w:type="dxa"/>
-        </w:trPr>
-        <w:tc>
-          <w:tcPr>
-            <w:tcW w:w="0" w:type="auto"/>
-            <w:vAlign w:val="center"/>
-            <w:hideMark/>
-          </w:tcPr>
-          <w:p>
-            <w:r>
-              <w:t>Flickering finger detection</w:t>
-            </w:r>
-          </w:p>
-        </w:tc>
-        <w:tc>
-          <w:tcPr>
-            <w:tcW w:w="0" w:type="auto"/>
-            <w:vAlign w:val="center"/>
-            <w:hideMark/>
-          </w:tcPr>
-          <w:p>
-            <w:r>
-              <w:t>Add temporal smoothing</w:t>
-            </w:r>
-          </w:p>
-        </w:tc>
-      </w:tr>
-      <w:tr>
-        <w:trPr>
-          <w:tblCellSpacing w:w="15" w:type="dxa"/>
-        </w:trPr>
-        <w:tc>
-          <w:tcPr>
-            <w:tcW w:w="0" w:type="auto"/>
-            <w:vAlign w:val="center"/>
-            <w:hideMark/>
-          </w:tcPr>
-          <w:p>
-            <w:r>
-              <w:t>False triggers</w:t>
-            </w:r>
-          </w:p>
-        </w:tc>
-        <w:tc>
-          <w:tcPr>
-            <w:tcW w:w="0" w:type="auto"/>
-            <w:vAlign w:val="center"/>
-            <w:hideMark/>
-          </w:tcPr>
-          <w:p>
-            <w:r>
-              <w:t>Add debounce logic</w:t>
-            </w:r>
-          </w:p>
-        </w:tc>
-      </w:tr>
-      <w:tr>
-        <w:trPr>
-          <w:tblCellSpacing w:w="15" w:type="dxa"/>
-        </w:trPr>
-        <w:tc>
-          <w:tcPr>
-            <w:tcW w:w="0" w:type="auto"/>
-            <w:vAlign w:val="center"/>
-            <w:hideMark/>
-          </w:tcPr>
-          <w:p>
-            <w:r>
-              <w:t>Hand overlap confusion</w:t>
-            </w:r>
-          </w:p>
-        </w:tc>
-        <w:tc>
-          <w:tcPr>
-            <w:tcW w:w="0" w:type="auto"/>
-            <w:vAlign w:val="center"/>
-            <w:hideMark/>
-          </w:tcPr>
-          <w:p>
-            <w:r>
-              <w:t>Track hand IDs</w:t>
-            </w:r>
-          </w:p>
-        </w:tc>
-      </w:tr>
-      <w:tr>
-        <w:trPr>
-          <w:tblCellSpacing w:w="15" w:type="dxa"/>
-        </w:trPr>
-        <w:tc>
-          <w:tcPr>
-            <w:tcW w:w="0" w:type="auto"/>
-            <w:vAlign w:val="center"/>
-            <w:hideMark/>
-          </w:tcPr>
-          <w:p>
-            <w:r>
-              <w:t>Swipe misfires</w:t>
-            </w:r>
-          </w:p>
-        </w:tc>
-        <w:tc>
-          <w:tcPr>
-            <w:tcW w:w="0" w:type="auto"/>
-            <w:vAlign w:val="center"/>
-            <w:hideMark/>
-          </w:tcPr>
-          <w:p>
-            <w:r>
-              <w:t>Add velocity threshold</w:t>
-            </w:r>
-          </w:p>
-        </w:tc>
-      </w:tr>
-    </w:tbl>
     <w:p/>
     <w:sectPr>
       <w:pgSz w:w="11906" w:h="16838"/>
@@ -4748,6 +2565,7 @@
   <w:style w:type="character" w:default="1" w:styleId="DefaultParagraphFont">
     <w:name w:val="Default Paragraph Font"/>
     <w:uiPriority w:val="1"/>
+    <w:semiHidden/>
     <w:unhideWhenUsed/>
   </w:style>
   <w:style w:type="table" w:default="1" w:styleId="TableNormal">

</xml_diff>